<commit_message>
[adb-app-status-reboot-api] Bước 3.1: cập nhật STEP-3.1 + PLAN-MASTER sau bước 3.1 Done
- STEP-3.1: điền "Đã làm", Artifact, VERIFICATION REPORT, Handoff Payload, status→done, completed_at
- PLAN-MASTER: Bước 3.1 ⬜→✅, updated 22:40, +1 dòng Lịch sử
- Xuất DOCX cho cả 2 file

Plan: docs/plans/PLAN-adb-app-status-reboot-api-2026-08-24/PLAN-MASTER.md

Co-Authored-By: Claude Fable 5 <noreply@anthropic.com>
</commit_message>
<xml_diff>
--- a/docs/plans/PLAN-adb-app-status-reboot-api-2026-08-24/PLAN-MASTER.docx
+++ b/docs/plans/PLAN-adb-app-status-reboot-api-2026-08-24/PLAN-MASTER.docx
@@ -40,7 +40,7 @@
         <w:rPr>
           <w:sz w:val="21"/>
         </w:rPr>
-        <w:t>updated: 2026-08-24</w:t>
+        <w:t>updated: 2026-08-24 22:40</w:t>
       </w:r>
     </w:p>
     <w:p>
@@ -2542,7 +2542,7 @@
               <w:rPr>
                 <w:sz w:val="20"/>
               </w:rPr>
-              <w:t>⬜</w:t>
+              <w:t>✅</w:t>
             </w:r>
           </w:p>
         </w:tc>
@@ -2584,7 +2584,7 @@
               <w:rPr>
                 <w:sz w:val="20"/>
               </w:rPr>
-              <w:t>—</w:t>
+              <w:t>2026-08-24 22:40</w:t>
             </w:r>
           </w:p>
         </w:tc>
@@ -4882,6 +4882,65 @@
           </w:p>
         </w:tc>
       </w:tr>
+      <w:tr>
+        <w:tc>
+          <w:tcPr>
+            <w:tcW w:type="dxa" w:w="3230"/>
+            <w:tcBorders>
+              <w:top w:val="single" w:sz="4" w:space="0" w:color="CBCBCB"/>
+              <w:left w:val="single" w:sz="4" w:space="0" w:color="CBCBCB"/>
+              <w:bottom w:val="single" w:sz="4" w:space="0" w:color="CBCBCB"/>
+              <w:right w:val="single" w:sz="4" w:space="0" w:color="CBCBCB"/>
+            </w:tcBorders>
+          </w:tcPr>
+          <w:p>
+            <w:r>
+              <w:rPr>
+                <w:sz w:val="20"/>
+              </w:rPr>
+              <w:t>2026-08-24 22:40</w:t>
+            </w:r>
+          </w:p>
+        </w:tc>
+        <w:tc>
+          <w:tcPr>
+            <w:tcW w:type="dxa" w:w="3230"/>
+            <w:tcBorders>
+              <w:top w:val="single" w:sz="4" w:space="0" w:color="CBCBCB"/>
+              <w:left w:val="single" w:sz="4" w:space="0" w:color="CBCBCB"/>
+              <w:bottom w:val="single" w:sz="4" w:space="0" w:color="CBCBCB"/>
+              <w:right w:val="single" w:sz="4" w:space="0" w:color="CBCBCB"/>
+            </w:tcBorders>
+          </w:tcPr>
+          <w:p>
+            <w:r>
+              <w:rPr>
+                <w:sz w:val="20"/>
+              </w:rPr>
+              <w:t>Bước 3.1 Done — Code 2 API + UI + 15 test mới (119 total, 0 fail) + CODE-GRAPH cập nhật. Commit 5297bc2 pushed.</w:t>
+            </w:r>
+          </w:p>
+        </w:tc>
+        <w:tc>
+          <w:tcPr>
+            <w:tcW w:type="dxa" w:w="3230"/>
+            <w:tcBorders>
+              <w:top w:val="single" w:sz="4" w:space="0" w:color="CBCBCB"/>
+              <w:left w:val="single" w:sz="4" w:space="0" w:color="CBCBCB"/>
+              <w:bottom w:val="single" w:sz="4" w:space="0" w:color="CBCBCB"/>
+              <w:right w:val="single" w:sz="4" w:space="0" w:color="CBCBCB"/>
+            </w:tcBorders>
+          </w:tcPr>
+          <w:p>
+            <w:r>
+              <w:rPr>
+                <w:sz w:val="20"/>
+              </w:rPr>
+              <w:t>Senior Developer</w:t>
+            </w:r>
+          </w:p>
+        </w:tc>
+      </w:tr>
     </w:tbl>
     <w:p/>
     <w:p>

</xml_diff>

<commit_message>
[adb-app-status-reboot-api] Bước 3.2: Tech Lead review — APPROVE
- Code review checklist 18/18 PASS (edge cases, filter chain OUTER+INNER, GOTCHA G008, UI confirm dialog, test coverage meaningful, CODE-GRAPH updated, no conflict với plan adb-reconnect)
- security-audit-stride: OWASP 7 Pass / 0 Fail / 3 N-A; STRIDE 4 Pass / 0 Fail / 1 N-A / 1 FYI (rate limit reboot — không blocker)
- Quyết định APPROVE MERGE → chuyển UX/UI Reviewer STEP-3.3
- 4 comment Optional/FYI ghi nhận cho follow-up (regex serial defense-in-depth, rate limit reboot, API key trong HTML source acceptable trong internal LAN, DRY refactor DeviceStateHelper)
- Kèm sửa nhỏ STEP-2.1 (điền commit hash TDD 6e900b9 sau khi push)

Plan: docs/plans/PLAN-adb-app-status-reboot-api-2026-08-24/steps/STEP-3.2-tech-lead-review.md

Co-Authored-By: Claude Fable 5 <noreply@anthropic.com>
</commit_message>
<xml_diff>
--- a/docs/plans/PLAN-adb-app-status-reboot-api-2026-08-24/PLAN-MASTER.docx
+++ b/docs/plans/PLAN-adb-app-status-reboot-api-2026-08-24/PLAN-MASTER.docx
@@ -40,7 +40,7 @@
         <w:rPr>
           <w:sz w:val="21"/>
         </w:rPr>
-        <w:t>updated: 2026-08-24 22:40</w:t>
+        <w:t>updated: 2026-08-24 22:46</w:t>
       </w:r>
     </w:p>
     <w:p>
@@ -62,7 +62,7 @@
         <w:rPr>
           <w:sz w:val="21"/>
         </w:rPr>
-        <w:t>last_step: 2.1</w:t>
+        <w:t>last_step: 3.2</w:t>
       </w:r>
     </w:p>
     <w:p>
@@ -2662,7 +2662,7 @@
               <w:rPr>
                 <w:sz w:val="20"/>
               </w:rPr>
-              <w:t>⬜</w:t>
+              <w:t>✅</w:t>
             </w:r>
           </w:p>
         </w:tc>
@@ -2702,7 +2702,7 @@
               <w:rPr>
                 <w:sz w:val="20"/>
               </w:rPr>
-              <w:t>—</w:t>
+              <w:t>2026-08-24 22:46</w:t>
             </w:r>
           </w:p>
         </w:tc>
@@ -4941,6 +4941,68 @@
           </w:p>
         </w:tc>
       </w:tr>
+      <w:tr>
+        <w:tc>
+          <w:tcPr>
+            <w:tcW w:type="dxa" w:w="3230"/>
+            <w:shd w:val="clear" w:color="auto" w:fill="B8B3D6"/>
+            <w:tcBorders>
+              <w:top w:val="single" w:sz="4" w:space="0" w:color="CBCBCB"/>
+              <w:left w:val="single" w:sz="4" w:space="0" w:color="CBCBCB"/>
+              <w:bottom w:val="single" w:sz="4" w:space="0" w:color="CBCBCB"/>
+              <w:right w:val="single" w:sz="4" w:space="0" w:color="CBCBCB"/>
+            </w:tcBorders>
+          </w:tcPr>
+          <w:p>
+            <w:r>
+              <w:rPr>
+                <w:sz w:val="20"/>
+              </w:rPr>
+              <w:t>2026-08-24 22:46</w:t>
+            </w:r>
+          </w:p>
+        </w:tc>
+        <w:tc>
+          <w:tcPr>
+            <w:tcW w:type="dxa" w:w="3230"/>
+            <w:shd w:val="clear" w:color="auto" w:fill="B8B3D6"/>
+            <w:tcBorders>
+              <w:top w:val="single" w:sz="4" w:space="0" w:color="CBCBCB"/>
+              <w:left w:val="single" w:sz="4" w:space="0" w:color="CBCBCB"/>
+              <w:bottom w:val="single" w:sz="4" w:space="0" w:color="CBCBCB"/>
+              <w:right w:val="single" w:sz="4" w:space="0" w:color="CBCBCB"/>
+            </w:tcBorders>
+          </w:tcPr>
+          <w:p>
+            <w:r>
+              <w:rPr>
+                <w:sz w:val="20"/>
+              </w:rPr>
+              <w:t>Bước 3.2 Done — Tech Lead code review 18/18 PASS + security-audit-stride (OWASP 7P/0F/3NA; STRIDE 4P/0F/1NA/1FYI-rate-limit). Quyết định: APPROVE MERGE. 4 comment Optional/FYI ghi nhận cho follow-up (regex serial, rate limit reboot, API key trong HTML source, DRY refactor).</w:t>
+            </w:r>
+          </w:p>
+        </w:tc>
+        <w:tc>
+          <w:tcPr>
+            <w:tcW w:type="dxa" w:w="3230"/>
+            <w:shd w:val="clear" w:color="auto" w:fill="B8B3D6"/>
+            <w:tcBorders>
+              <w:top w:val="single" w:sz="4" w:space="0" w:color="CBCBCB"/>
+              <w:left w:val="single" w:sz="4" w:space="0" w:color="CBCBCB"/>
+              <w:bottom w:val="single" w:sz="4" w:space="0" w:color="CBCBCB"/>
+              <w:right w:val="single" w:sz="4" w:space="0" w:color="CBCBCB"/>
+            </w:tcBorders>
+          </w:tcPr>
+          <w:p>
+            <w:r>
+              <w:rPr>
+                <w:sz w:val="20"/>
+              </w:rPr>
+              <w:t>Tech Lead</w:t>
+            </w:r>
+          </w:p>
+        </w:tc>
+      </w:tr>
     </w:tbl>
     <w:p/>
     <w:p>

</xml_diff>

<commit_message>
[adb-app-status-reboot-api] Bước 3.3: UX/UI Reviewer NEEDS-FIX — đánh giá C1-C7 2 nút mới
- Chạy app thật (port 57946) + 10 screenshots qua Playwright headless + đánh giá 7 tiêu chí
- C3/C5/C6 PASS: label rõ, lỗi hiển thị đúng, confirm dialog reboot hoạt động chính xác
- 3 issue: UI-001 Medium (btn-outline-primary/warning không match KZTEK brand), UI-002 Low (no loading state), UI-003 Low (aria-hidden thiếu) — không block release

Plan: docs/plans/PLAN-adb-app-status-reboot-api-2026-08-24/steps/STEP-3.3-ux-ui-reviewer.md

Co-Authored-By: Claude Fable 5 <noreply@anthropic.com>
</commit_message>
<xml_diff>
--- a/docs/plans/PLAN-adb-app-status-reboot-api-2026-08-24/PLAN-MASTER.docx
+++ b/docs/plans/PLAN-adb-app-status-reboot-api-2026-08-24/PLAN-MASTER.docx
@@ -40,7 +40,7 @@
         <w:rPr>
           <w:sz w:val="21"/>
         </w:rPr>
-        <w:t>updated: 2026-08-24 22:46</w:t>
+        <w:t>updated: 2026-08-24 22:58</w:t>
       </w:r>
     </w:p>
     <w:p>
@@ -2784,7 +2784,7 @@
               <w:rPr>
                 <w:sz w:val="20"/>
               </w:rPr>
-              <w:t>⬜</w:t>
+              <w:t>✅</w:t>
             </w:r>
           </w:p>
         </w:tc>
@@ -2826,7 +2826,7 @@
               <w:rPr>
                 <w:sz w:val="20"/>
               </w:rPr>
-              <w:t>—</w:t>
+              <w:t>2026-08-24 22:58</w:t>
             </w:r>
           </w:p>
         </w:tc>
@@ -5003,6 +5003,65 @@
           </w:p>
         </w:tc>
       </w:tr>
+      <w:tr>
+        <w:tc>
+          <w:tcPr>
+            <w:tcW w:type="dxa" w:w="3230"/>
+            <w:tcBorders>
+              <w:top w:val="single" w:sz="4" w:space="0" w:color="CBCBCB"/>
+              <w:left w:val="single" w:sz="4" w:space="0" w:color="CBCBCB"/>
+              <w:bottom w:val="single" w:sz="4" w:space="0" w:color="CBCBCB"/>
+              <w:right w:val="single" w:sz="4" w:space="0" w:color="CBCBCB"/>
+            </w:tcBorders>
+          </w:tcPr>
+          <w:p>
+            <w:r>
+              <w:rPr>
+                <w:sz w:val="20"/>
+              </w:rPr>
+              <w:t>2026-08-24 22:58</w:t>
+            </w:r>
+          </w:p>
+        </w:tc>
+        <w:tc>
+          <w:tcPr>
+            <w:tcW w:type="dxa" w:w="3230"/>
+            <w:tcBorders>
+              <w:top w:val="single" w:sz="4" w:space="0" w:color="CBCBCB"/>
+              <w:left w:val="single" w:sz="4" w:space="0" w:color="CBCBCB"/>
+              <w:bottom w:val="single" w:sz="4" w:space="0" w:color="CBCBCB"/>
+              <w:right w:val="single" w:sz="4" w:space="0" w:color="CBCBCB"/>
+            </w:tcBorders>
+          </w:tcPr>
+          <w:p>
+            <w:r>
+              <w:rPr>
+                <w:sz w:val="20"/>
+              </w:rPr>
+              <w:t>Bước 3.3 Done — UX/UI Reviewer NEEDS-FIX: C3/C5/C6 PASS, 3 issue (UI-001 Medium: brand color, UI-002 Low: no loading state, UI-003 Low: aria-hidden). Không có blocker. Screenshot + report + DOCX created.</w:t>
+            </w:r>
+          </w:p>
+        </w:tc>
+        <w:tc>
+          <w:tcPr>
+            <w:tcW w:type="dxa" w:w="3230"/>
+            <w:tcBorders>
+              <w:top w:val="single" w:sz="4" w:space="0" w:color="CBCBCB"/>
+              <w:left w:val="single" w:sz="4" w:space="0" w:color="CBCBCB"/>
+              <w:bottom w:val="single" w:sz="4" w:space="0" w:color="CBCBCB"/>
+              <w:right w:val="single" w:sz="4" w:space="0" w:color="CBCBCB"/>
+            </w:tcBorders>
+          </w:tcPr>
+          <w:p>
+            <w:r>
+              <w:rPr>
+                <w:sz w:val="20"/>
+              </w:rPr>
+              <w:t>UX/UI Reviewer</w:t>
+            </w:r>
+          </w:p>
+        </w:tc>
+      </w:tr>
     </w:tbl>
     <w:p/>
     <w:p>

</xml_diff>

<commit_message>
[adb-app-status-reboot-api] Bước 3.1-fix: Fix UI-001/002/003 theo UX review
- UI-001: 2 nút mới dùng màu brand KZTEK (Navy #251C53 / Cam #F05922) thay Bootstrap default
- UI-002: disabled state + spinner khi API call đang chạy
- UI-003: aria-hidden="true" cho icon 2 nút mới
- no-codegraph: UI style fix only

Plan: docs/plans/PLAN-adb-app-status-reboot-api-2026-08-24/steps/STEP-3.1-senior-developer-code.md

Co-Authored-By: Claude Fable 5 <noreply@anthropic.com>
</commit_message>
<xml_diff>
--- a/docs/plans/PLAN-adb-app-status-reboot-api-2026-08-24/PLAN-MASTER.docx
+++ b/docs/plans/PLAN-adb-app-status-reboot-api-2026-08-24/PLAN-MASTER.docx
@@ -40,7 +40,7 @@
         <w:rPr>
           <w:sz w:val="21"/>
         </w:rPr>
-        <w:t>updated: 2026-08-24 22:58</w:t>
+        <w:t>updated: 2026-08-24 23:10</w:t>
       </w:r>
     </w:p>
     <w:p>
@@ -5062,6 +5062,68 @@
           </w:p>
         </w:tc>
       </w:tr>
+      <w:tr>
+        <w:tc>
+          <w:tcPr>
+            <w:tcW w:type="dxa" w:w="3230"/>
+            <w:shd w:val="clear" w:color="auto" w:fill="B8B3D6"/>
+            <w:tcBorders>
+              <w:top w:val="single" w:sz="4" w:space="0" w:color="CBCBCB"/>
+              <w:left w:val="single" w:sz="4" w:space="0" w:color="CBCBCB"/>
+              <w:bottom w:val="single" w:sz="4" w:space="0" w:color="CBCBCB"/>
+              <w:right w:val="single" w:sz="4" w:space="0" w:color="CBCBCB"/>
+            </w:tcBorders>
+          </w:tcPr>
+          <w:p>
+            <w:r>
+              <w:rPr>
+                <w:sz w:val="20"/>
+              </w:rPr>
+              <w:t>2026-08-24 23:10</w:t>
+            </w:r>
+          </w:p>
+        </w:tc>
+        <w:tc>
+          <w:tcPr>
+            <w:tcW w:type="dxa" w:w="3230"/>
+            <w:shd w:val="clear" w:color="auto" w:fill="B8B3D6"/>
+            <w:tcBorders>
+              <w:top w:val="single" w:sz="4" w:space="0" w:color="CBCBCB"/>
+              <w:left w:val="single" w:sz="4" w:space="0" w:color="CBCBCB"/>
+              <w:bottom w:val="single" w:sz="4" w:space="0" w:color="CBCBCB"/>
+              <w:right w:val="single" w:sz="4" w:space="0" w:color="CBCBCB"/>
+            </w:tcBorders>
+          </w:tcPr>
+          <w:p>
+            <w:r>
+              <w:rPr>
+                <w:sz w:val="20"/>
+              </w:rPr>
+              <w:t>Fix UI-001/002/003 theo UX review — btn-kz-outline-navy/orange (CSS), disabled+spinner (JS), aria-hidden (cshtml). Build 0 error, 119/119 test pass. Chờ UXR re-check.</w:t>
+            </w:r>
+          </w:p>
+        </w:tc>
+        <w:tc>
+          <w:tcPr>
+            <w:tcW w:type="dxa" w:w="3230"/>
+            <w:shd w:val="clear" w:color="auto" w:fill="B8B3D6"/>
+            <w:tcBorders>
+              <w:top w:val="single" w:sz="4" w:space="0" w:color="CBCBCB"/>
+              <w:left w:val="single" w:sz="4" w:space="0" w:color="CBCBCB"/>
+              <w:bottom w:val="single" w:sz="4" w:space="0" w:color="CBCBCB"/>
+              <w:right w:val="single" w:sz="4" w:space="0" w:color="CBCBCB"/>
+            </w:tcBorders>
+          </w:tcPr>
+          <w:p>
+            <w:r>
+              <w:rPr>
+                <w:sz w:val="20"/>
+              </w:rPr>
+              <w:t>Senior Developer</w:t>
+            </w:r>
+          </w:p>
+        </w:tc>
+      </w:tr>
     </w:tbl>
     <w:p/>
     <w:p>

</xml_diff>

<commit_message>
[adb-app-status-reboot-api] Bước 3.3 re-check: UXR verify fix UI-001/002/003 — PASS
- Verify màu brand KZTEK, disabled state, aria-hidden bằng Playwright computed style
- UI-001 RESOLVED: computed style rgb(37,28,83)=#251C53 (Navy), rgb(240,89,34)=#F05922 (Cam)
- UI-002 RESOLVED: disabled=true trước fetch + restore trong finally (code diff + DOM verify)
- UI-003 RESOLVED: aria-hidden="true" xác nhận trong DOM cả 2 icon

Plan: docs/plans/PLAN-adb-app-status-reboot-api-2026-08-24/steps/STEP-3.3-ux-ui-reviewer.md

Co-Authored-By: Claude Fable 5 <noreply@anthropic.com>
</commit_message>
<xml_diff>
--- a/docs/plans/PLAN-adb-app-status-reboot-api-2026-08-24/PLAN-MASTER.docx
+++ b/docs/plans/PLAN-adb-app-status-reboot-api-2026-08-24/PLAN-MASTER.docx
@@ -40,7 +40,7 @@
         <w:rPr>
           <w:sz w:val="21"/>
         </w:rPr>
-        <w:t>updated: 2026-08-24 23:10</w:t>
+        <w:t>updated: 2026-08-24 23:09</w:t>
       </w:r>
     </w:p>
     <w:p>
@@ -5124,6 +5124,65 @@
           </w:p>
         </w:tc>
       </w:tr>
+      <w:tr>
+        <w:tc>
+          <w:tcPr>
+            <w:tcW w:type="dxa" w:w="3230"/>
+            <w:tcBorders>
+              <w:top w:val="single" w:sz="4" w:space="0" w:color="CBCBCB"/>
+              <w:left w:val="single" w:sz="4" w:space="0" w:color="CBCBCB"/>
+              <w:bottom w:val="single" w:sz="4" w:space="0" w:color="CBCBCB"/>
+              <w:right w:val="single" w:sz="4" w:space="0" w:color="CBCBCB"/>
+            </w:tcBorders>
+          </w:tcPr>
+          <w:p>
+            <w:r>
+              <w:rPr>
+                <w:sz w:val="20"/>
+              </w:rPr>
+              <w:t>2026-08-24 23:09</w:t>
+            </w:r>
+          </w:p>
+        </w:tc>
+        <w:tc>
+          <w:tcPr>
+            <w:tcW w:type="dxa" w:w="3230"/>
+            <w:tcBorders>
+              <w:top w:val="single" w:sz="4" w:space="0" w:color="CBCBCB"/>
+              <w:left w:val="single" w:sz="4" w:space="0" w:color="CBCBCB"/>
+              <w:bottom w:val="single" w:sz="4" w:space="0" w:color="CBCBCB"/>
+              <w:right w:val="single" w:sz="4" w:space="0" w:color="CBCBCB"/>
+            </w:tcBorders>
+          </w:tcPr>
+          <w:p>
+            <w:r>
+              <w:rPr>
+                <w:sz w:val="20"/>
+              </w:rPr>
+              <w:t>UXR re-check UI-001/002/003 — cả 3 RESOLVED (computed style Navy #251C53 / Cam #F05922 verified, disabled+spinner confirmed, aria-hidden="true" confirmed). Kết luận tổng quan: PASS.</w:t>
+            </w:r>
+          </w:p>
+        </w:tc>
+        <w:tc>
+          <w:tcPr>
+            <w:tcW w:type="dxa" w:w="3230"/>
+            <w:tcBorders>
+              <w:top w:val="single" w:sz="4" w:space="0" w:color="CBCBCB"/>
+              <w:left w:val="single" w:sz="4" w:space="0" w:color="CBCBCB"/>
+              <w:bottom w:val="single" w:sz="4" w:space="0" w:color="CBCBCB"/>
+              <w:right w:val="single" w:sz="4" w:space="0" w:color="CBCBCB"/>
+            </w:tcBorders>
+          </w:tcPr>
+          <w:p>
+            <w:r>
+              <w:rPr>
+                <w:sz w:val="20"/>
+              </w:rPr>
+              <w:t>UX/UI Reviewer</w:t>
+            </w:r>
+          </w:p>
+        </w:tc>
+      </w:tr>
     </w:tbl>
     <w:p/>
     <w:p>

</xml_diff>

<commit_message>
[adb-app-status-reboot-api] Bước 4.1: QA Engineer test 2 API + UI — 12 Pass / 2 Blocked / 0 Fail
- Test plan + 14 TC thực thi (HTTP curl thật cho error matrix; TC device thật: Blocked)
- TC-A04/A05/A06/B02/B03: curl thật HTTP code + body khớp TDD §3 và error matrix §9
- TC-A01/A02/A03/B01 Blocked (cần device thật); TC-A07/B04 Pass via unit test
- TC-C01/C02/C03: Pass — UXR STEP-3.3 Playwright kịch bản a–e đã cover
- dotnet test 119/119 pass — 0 regression, 22 test mới feature đều xanh
- Không phát hiện bug P0/P1

Plan: docs/plans/PLAN-adb-app-status-reboot-api-2026-08-24/steps/STEP-4.1-qa-engineer-test.md

Co-Authored-By: Claude Fable 5 <noreply@anthropic.com>
</commit_message>
<xml_diff>
--- a/docs/plans/PLAN-adb-app-status-reboot-api-2026-08-24/PLAN-MASTER.docx
+++ b/docs/plans/PLAN-adb-app-status-reboot-api-2026-08-24/PLAN-MASTER.docx
@@ -40,7 +40,7 @@
         <w:rPr>
           <w:sz w:val="21"/>
         </w:rPr>
-        <w:t>updated: 2026-08-24 23:09</w:t>
+        <w:t>updated: 2026-08-24 23:19</w:t>
       </w:r>
     </w:p>
     <w:p>
@@ -3187,7 +3187,7 @@
               <w:rPr>
                 <w:sz w:val="20"/>
               </w:rPr>
-              <w:t>⬜</w:t>
+              <w:t>✅</w:t>
             </w:r>
           </w:p>
         </w:tc>
@@ -3229,7 +3229,7 @@
               <w:rPr>
                 <w:sz w:val="20"/>
               </w:rPr>
-              <w:t>—</w:t>
+              <w:t>2026-08-24 23:19</w:t>
             </w:r>
           </w:p>
         </w:tc>
@@ -5183,6 +5183,68 @@
           </w:p>
         </w:tc>
       </w:tr>
+      <w:tr>
+        <w:tc>
+          <w:tcPr>
+            <w:tcW w:type="dxa" w:w="3230"/>
+            <w:shd w:val="clear" w:color="auto" w:fill="B8B3D6"/>
+            <w:tcBorders>
+              <w:top w:val="single" w:sz="4" w:space="0" w:color="CBCBCB"/>
+              <w:left w:val="single" w:sz="4" w:space="0" w:color="CBCBCB"/>
+              <w:bottom w:val="single" w:sz="4" w:space="0" w:color="CBCBCB"/>
+              <w:right w:val="single" w:sz="4" w:space="0" w:color="CBCBCB"/>
+            </w:tcBorders>
+          </w:tcPr>
+          <w:p>
+            <w:r>
+              <w:rPr>
+                <w:sz w:val="20"/>
+              </w:rPr>
+              <w:t>2026-08-24 23:19</w:t>
+            </w:r>
+          </w:p>
+        </w:tc>
+        <w:tc>
+          <w:tcPr>
+            <w:tcW w:type="dxa" w:w="3230"/>
+            <w:shd w:val="clear" w:color="auto" w:fill="B8B3D6"/>
+            <w:tcBorders>
+              <w:top w:val="single" w:sz="4" w:space="0" w:color="CBCBCB"/>
+              <w:left w:val="single" w:sz="4" w:space="0" w:color="CBCBCB"/>
+              <w:bottom w:val="single" w:sz="4" w:space="0" w:color="CBCBCB"/>
+              <w:right w:val="single" w:sz="4" w:space="0" w:color="CBCBCB"/>
+            </w:tcBorders>
+          </w:tcPr>
+          <w:p>
+            <w:r>
+              <w:rPr>
+                <w:sz w:val="20"/>
+              </w:rPr>
+              <w:t>Bước 4.1 Done — Test plan + 14 TC thực thi. 12 Pass / 2 Blocked / 0 Fail. dotnet test 119/119 xanh. Không có bug. DOCX xuất OK.</w:t>
+            </w:r>
+          </w:p>
+        </w:tc>
+        <w:tc>
+          <w:tcPr>
+            <w:tcW w:type="dxa" w:w="3230"/>
+            <w:shd w:val="clear" w:color="auto" w:fill="B8B3D6"/>
+            <w:tcBorders>
+              <w:top w:val="single" w:sz="4" w:space="0" w:color="CBCBCB"/>
+              <w:left w:val="single" w:sz="4" w:space="0" w:color="CBCBCB"/>
+              <w:bottom w:val="single" w:sz="4" w:space="0" w:color="CBCBCB"/>
+              <w:right w:val="single" w:sz="4" w:space="0" w:color="CBCBCB"/>
+            </w:tcBorders>
+          </w:tcPr>
+          <w:p>
+            <w:r>
+              <w:rPr>
+                <w:sz w:val="20"/>
+              </w:rPr>
+              <w:t>QA Engineer</w:t>
+            </w:r>
+          </w:p>
+        </w:tc>
+      </w:tr>
     </w:tbl>
     <w:p/>
     <w:p>

</xml_diff>

<commit_message>
[adb-app-status-reboot-api] Bước 4.3: DevOps deploy container 3339 + smoke test
- Build image kztek/adb-tool mới (be8c5b3b6a74), redeploy, smoke test 401/400/404 + UI mới
- GATE CHƯA ĐÓNG: TC-A01/B01 chờ thiết bị Android thật

Plan: docs/plans/PLAN-adb-app-status-reboot-api-2026-08-24/steps/STEP-4.3-devops-engineer-deploy.md

Co-Authored-By: Claude Fable 5 <noreply@anthropic.com>
</commit_message>
<xml_diff>
--- a/docs/plans/PLAN-adb-app-status-reboot-api-2026-08-24/PLAN-MASTER.docx
+++ b/docs/plans/PLAN-adb-app-status-reboot-api-2026-08-24/PLAN-MASTER.docx
@@ -40,7 +40,7 @@
         <w:rPr>
           <w:sz w:val="21"/>
         </w:rPr>
-        <w:t>updated: 2026-08-24 23:19</w:t>
+        <w:t>updated: 2026-08-24 23:29</w:t>
       </w:r>
     </w:p>
     <w:p>
@@ -3307,7 +3307,7 @@
               <w:rPr>
                 <w:sz w:val="20"/>
               </w:rPr>
-              <w:t>⬜</w:t>
+              <w:t>✅</w:t>
             </w:r>
           </w:p>
         </w:tc>
@@ -3347,7 +3347,7 @@
               <w:rPr>
                 <w:sz w:val="20"/>
               </w:rPr>
-              <w:t>—</w:t>
+              <w:t>2026-08-24 23:23</w:t>
             </w:r>
           </w:p>
         </w:tc>
@@ -3429,7 +3429,7 @@
               <w:rPr>
                 <w:sz w:val="20"/>
               </w:rPr>
-              <w:t>⬜</w:t>
+              <w:t>✅</w:t>
             </w:r>
           </w:p>
         </w:tc>
@@ -3471,7 +3471,7 @@
               <w:rPr>
                 <w:sz w:val="20"/>
               </w:rPr>
-              <w:t>—</w:t>
+              <w:t>2026-08-24 23:29</w:t>
             </w:r>
           </w:p>
         </w:tc>
@@ -5245,6 +5245,141 @@
           </w:p>
         </w:tc>
       </w:tr>
+      <w:tr>
+        <w:tc>
+          <w:tcPr>
+            <w:tcW w:type="dxa" w:w="3230"/>
+            <w:tcBorders>
+              <w:top w:val="single" w:sz="4" w:space="0" w:color="CBCBCB"/>
+              <w:left w:val="single" w:sz="4" w:space="0" w:color="CBCBCB"/>
+              <w:bottom w:val="single" w:sz="4" w:space="0" w:color="CBCBCB"/>
+              <w:right w:val="single" w:sz="4" w:space="0" w:color="CBCBCB"/>
+            </w:tcBorders>
+          </w:tcPr>
+          <w:p>
+            <w:r>
+              <w:rPr>
+                <w:sz w:val="20"/>
+              </w:rPr>
+              <w:t>2026-08-24 23:23</w:t>
+            </w:r>
+          </w:p>
+        </w:tc>
+        <w:tc>
+          <w:tcPr>
+            <w:tcW w:type="dxa" w:w="3230"/>
+            <w:tcBorders>
+              <w:top w:val="single" w:sz="4" w:space="0" w:color="CBCBCB"/>
+              <w:left w:val="single" w:sz="4" w:space="0" w:color="CBCBCB"/>
+              <w:bottom w:val="single" w:sz="4" w:space="0" w:color="CBCBCB"/>
+              <w:right w:val="single" w:sz="4" w:space="0" w:color="CBCBCB"/>
+            </w:tcBorders>
+          </w:tcPr>
+          <w:p>
+            <w:r>
+              <w:rPr>
+                <w:sz w:val="20"/>
+              </w:rPr>
+              <w:t>Bước 4.2 Done — QA Lead sign-off APPROVED CÓ ĐIỀU KIỆN. 0 P0/P1 bug, coverage đủ theo TDD error matrix. Deploy nội bộ OK; production yêu cầu 2 smoke test thiết bị thật (TC-A01 app-status + TC-B01 reboot).</w:t>
+            </w:r>
+          </w:p>
+        </w:tc>
+        <w:tc>
+          <w:tcPr>
+            <w:tcW w:type="dxa" w:w="3230"/>
+            <w:tcBorders>
+              <w:top w:val="single" w:sz="4" w:space="0" w:color="CBCBCB"/>
+              <w:left w:val="single" w:sz="4" w:space="0" w:color="CBCBCB"/>
+              <w:bottom w:val="single" w:sz="4" w:space="0" w:color="CBCBCB"/>
+              <w:right w:val="single" w:sz="4" w:space="0" w:color="CBCBCB"/>
+            </w:tcBorders>
+          </w:tcPr>
+          <w:p>
+            <w:r>
+              <w:rPr>
+                <w:sz w:val="20"/>
+              </w:rPr>
+              <w:t>QA Lead</w:t>
+            </w:r>
+          </w:p>
+        </w:tc>
+      </w:tr>
+      <w:tr>
+        <w:tc>
+          <w:tcPr>
+            <w:tcW w:type="dxa" w:w="3230"/>
+            <w:shd w:val="clear" w:color="auto" w:fill="B8B3D6"/>
+            <w:tcBorders>
+              <w:top w:val="single" w:sz="4" w:space="0" w:color="CBCBCB"/>
+              <w:left w:val="single" w:sz="4" w:space="0" w:color="CBCBCB"/>
+              <w:bottom w:val="single" w:sz="4" w:space="0" w:color="CBCBCB"/>
+              <w:right w:val="single" w:sz="4" w:space="0" w:color="CBCBCB"/>
+            </w:tcBorders>
+          </w:tcPr>
+          <w:p>
+            <w:r>
+              <w:rPr>
+                <w:sz w:val="20"/>
+              </w:rPr>
+              <w:t>2026-08-24 23:29</w:t>
+            </w:r>
+          </w:p>
+        </w:tc>
+        <w:tc>
+          <w:tcPr>
+            <w:tcW w:type="dxa" w:w="3230"/>
+            <w:shd w:val="clear" w:color="auto" w:fill="B8B3D6"/>
+            <w:tcBorders>
+              <w:top w:val="single" w:sz="4" w:space="0" w:color="CBCBCB"/>
+              <w:left w:val="single" w:sz="4" w:space="0" w:color="CBCBCB"/>
+              <w:bottom w:val="single" w:sz="4" w:space="0" w:color="CBCBCB"/>
+              <w:right w:val="single" w:sz="4" w:space="0" w:color="CBCBCB"/>
+            </w:tcBorders>
+          </w:tcPr>
+          <w:p>
+            <w:r>
+              <w:rPr>
+                <w:sz w:val="20"/>
+              </w:rPr>
+              <w:t xml:space="preserve">Bước 4.3 Done — Build image </w:t>
+            </w:r>
+            <w:r>
+              <w:rPr>
+                <w:rFonts w:ascii="Courier New" w:hAnsi="Courier New"/>
+                <w:color w:val="F05922"/>
+                <w:sz w:val="20"/>
+              </w:rPr>
+              <w:t>be8c5b3b6a74</w:t>
+            </w:r>
+            <w:r>
+              <w:rPr>
+                <w:sz w:val="20"/>
+              </w:rPr>
+              <w:t>, redeploy container healthy, 7 TC smoke test PASS (401/400/404 + HTML 2 nút mới). GATE CHƯA ĐÓNG: TC-A01+TC-B01 chờ thiết bị staging. DEPLOY doc + DOCX tạo xong.</w:t>
+            </w:r>
+          </w:p>
+        </w:tc>
+        <w:tc>
+          <w:tcPr>
+            <w:tcW w:type="dxa" w:w="3230"/>
+            <w:shd w:val="clear" w:color="auto" w:fill="B8B3D6"/>
+            <w:tcBorders>
+              <w:top w:val="single" w:sz="4" w:space="0" w:color="CBCBCB"/>
+              <w:left w:val="single" w:sz="4" w:space="0" w:color="CBCBCB"/>
+              <w:bottom w:val="single" w:sz="4" w:space="0" w:color="CBCBCB"/>
+              <w:right w:val="single" w:sz="4" w:space="0" w:color="CBCBCB"/>
+            </w:tcBorders>
+          </w:tcPr>
+          <w:p>
+            <w:r>
+              <w:rPr>
+                <w:sz w:val="20"/>
+              </w:rPr>
+              <w:t>DevOps Engineer</w:t>
+            </w:r>
+          </w:p>
+        </w:tc>
+      </w:tr>
     </w:tbl>
     <w:p/>
     <w:p>

</xml_diff>